<commit_message>
Add architecture diagram and GitHub link to report
</commit_message>
<xml_diff>
--- a/docs/Bao_cao_Bai_2_IoT_hoan_chinh.docx
+++ b/docs/Bao_cao_Bai_2_IoT_hoan_chinh.docx
@@ -60,6 +60,33 @@
     </w:p>
     <w:p>
       <w:pPr>
+        <w:spacing w:after="80"/>
+        <w:jc w:val="center"/>
+      </w:pPr>
+      <w:r>
+        <w:rPr>
+          <w:rFonts w:ascii="Times New Roman" w:hAnsi="Times New Roman" w:eastAsia="Times New Roman"/>
+          <w:b/>
+          <w:i w:val="0"/>
+          <w:color w:val="000000"/>
+          <w:sz w:val="18"/>
+        </w:rPr>
+        <w:t xml:space="preserve">Mã nguồn GitHub: </w:t>
+      </w:r>
+      <w:hyperlink r:id="rId14">
+        <w:r>
+          <w:rPr>
+            <w:rFonts w:ascii="Times New Roman" w:hAnsi="Times New Roman"/>
+            <w:color w:val="0563C1"/>
+            <w:u w:val="single"/>
+            <w:sz w:val="18"/>
+          </w:rPr>
+          <w:t>duy-tu2005/iot-lab2-telemetry-pipeline</w:t>
+        </w:r>
+      </w:hyperlink>
+    </w:p>
+    <w:p>
+      <w:pPr>
         <w:pStyle w:val="Heading1"/>
       </w:pPr>
       <w:r>
@@ -88,6 +115,55 @@
           <w:sz w:val="21"/>
         </w:rPr>
         <w:t>Bài thực hành xây dựng một pipeline IoT hoàn chỉnh từ thiết bị đến dashboard. ESP32 đọc nhiệt độ, độ ẩm và khoảng cách, đóng gói dữ liệu JSON rồi gửi qua MQTT. Gateway Python kiểm tra bản tin, phát hiện lỗi chuỗi và ghi dữ liệu vào InfluxDB. Dữ liệu sau đó được làm sạch, tổng hợp theo phút và hiển thị trên Grafana.</w:t>
+      </w:r>
+    </w:p>
+    <w:p>
+      <w:pPr>
+        <w:keepNext/>
+        <w:spacing w:before="20" w:after="20"/>
+        <w:jc w:val="center"/>
+      </w:pPr>
+      <w:r>
+        <w:drawing>
+          <wp:inline xmlns:a="http://schemas.openxmlformats.org/drawingml/2006/main" xmlns:pic="http://schemas.openxmlformats.org/drawingml/2006/picture">
+            <wp:extent cx="5989320" cy="1853837"/>
+            <wp:docPr id="1" name="Picture 1" descr="Hình 1. Sơ đồ kiến trúc hệ thống thu thập, lưu trữ, tiền xử lý và giám sát dữ liệu IoT" title="Hình 1. Sơ đồ kiến trúc hệ thống thu thập, lưu trữ, tiền xử lý và giám sát dữ liệu IoT"/>
+            <wp:cNvGraphicFramePr>
+              <a:graphicFrameLocks noChangeAspect="1"/>
+            </wp:cNvGraphicFramePr>
+            <a:graphic>
+              <a:graphicData uri="http://schemas.openxmlformats.org/drawingml/2006/picture">
+                <pic:pic>
+                  <pic:nvPicPr>
+                    <pic:cNvPr id="0" name="architecture_pipeline.png"/>
+                    <pic:cNvPicPr/>
+                  </pic:nvPicPr>
+                  <pic:blipFill>
+                    <a:blip r:embed="rId15"/>
+                    <a:stretch>
+                      <a:fillRect/>
+                    </a:stretch>
+                  </pic:blipFill>
+                  <pic:spPr>
+                    <a:xfrm>
+                      <a:off x="0" y="0"/>
+                      <a:ext cx="5989320" cy="1853837"/>
+                    </a:xfrm>
+                    <a:prstGeom prst="rect"/>
+                  </pic:spPr>
+                </pic:pic>
+              </a:graphicData>
+            </a:graphic>
+          </wp:inline>
+        </w:drawing>
+      </w:r>
+    </w:p>
+    <w:p>
+      <w:pPr>
+        <w:pStyle w:val="Caption"/>
+      </w:pPr>
+      <w:r>
+        <w:t>Hình 1. Sơ đồ kiến trúc hệ thống thu thập, lưu trữ, tiền xử lý và giám sát dữ liệu IoT</w:t>
       </w:r>
     </w:p>
     <w:tbl>
@@ -651,8 +727,8 @@
       <w:r>
         <w:drawing>
           <wp:inline xmlns:a="http://schemas.openxmlformats.org/drawingml/2006/main" xmlns:pic="http://schemas.openxmlformats.org/drawingml/2006/picture">
-            <wp:extent cx="3977639" cy="3379717"/>
-            <wp:docPr id="1" name="Picture 1" descr="Hình 1. Mô hình phần cứng ESP32, DHT22, HC-SR04 và LED trên Wokwi" title="Hình 1. Mô hình phần cứng ESP32, DHT22, HC-SR04 và LED trên Wokwi"/>
+            <wp:extent cx="3154680" cy="2680466"/>
+            <wp:docPr id="2" name="Picture 2" descr="Hình 2. Mô hình phần cứng ESP32, DHT22, HC-SR04 và LED trên Wokwi" title="Hình 2. Mô hình phần cứng ESP32, DHT22, HC-SR04 và LED trên Wokwi"/>
             <wp:cNvGraphicFramePr>
               <a:graphicFrameLocks noChangeAspect="1"/>
             </wp:cNvGraphicFramePr>
@@ -664,7 +740,7 @@
                     <pic:cNvPicPr/>
                   </pic:nvPicPr>
                   <pic:blipFill>
-                    <a:blip r:embed="rId14"/>
+                    <a:blip r:embed="rId16"/>
                     <a:stretch>
                       <a:fillRect/>
                     </a:stretch>
@@ -672,7 +748,7 @@
                   <pic:spPr>
                     <a:xfrm>
                       <a:off x="0" y="0"/>
-                      <a:ext cx="3977639" cy="3379717"/>
+                      <a:ext cx="3154680" cy="2680466"/>
                     </a:xfrm>
                     <a:prstGeom prst="rect"/>
                   </pic:spPr>
@@ -688,7 +764,7 @@
         <w:pStyle w:val="Caption"/>
       </w:pPr>
       <w:r>
-        <w:t>Hình 1. Mô hình phần cứng ESP32, DHT22, HC-SR04 và LED trên Wokwi</w:t>
+        <w:t>Hình 2. Mô hình phần cứng ESP32, DHT22, HC-SR04 và LED trên Wokwi</w:t>
       </w:r>
     </w:p>
     <w:p>
@@ -755,7 +831,7 @@
         <w:drawing>
           <wp:inline xmlns:a="http://schemas.openxmlformats.org/drawingml/2006/main" xmlns:pic="http://schemas.openxmlformats.org/drawingml/2006/picture">
             <wp:extent cx="5806440" cy="2376812"/>
-            <wp:docPr id="2" name="Picture 2" descr="Hình 2. ESP32 kết nối Wi-Fi, đồng bộ NTP và publish telemetry qua MQTT" title="Hình 2. ESP32 kết nối Wi-Fi, đồng bộ NTP và publish telemetry qua MQTT"/>
+            <wp:docPr id="3" name="Picture 3" descr="Hình 3. ESP32 kết nối Wi-Fi, đồng bộ NTP và publish telemetry qua MQTT" title="Hình 3. ESP32 kết nối Wi-Fi, đồng bộ NTP và publish telemetry qua MQTT"/>
             <wp:cNvGraphicFramePr>
               <a:graphicFrameLocks noChangeAspect="1"/>
             </wp:cNvGraphicFramePr>
@@ -767,7 +843,7 @@
                     <pic:cNvPicPr/>
                   </pic:nvPicPr>
                   <pic:blipFill>
-                    <a:blip r:embed="rId15"/>
+                    <a:blip r:embed="rId17"/>
                     <a:stretch>
                       <a:fillRect/>
                     </a:stretch>
@@ -791,7 +867,7 @@
         <w:pStyle w:val="Caption"/>
       </w:pPr>
       <w:r>
-        <w:t>Hình 2. ESP32 kết nối Wi-Fi, đồng bộ NTP và publish telemetry qua MQTT</w:t>
+        <w:t>Hình 3. ESP32 kết nối Wi-Fi, đồng bộ NTP và publish telemetry qua MQTT</w:t>
       </w:r>
     </w:p>
     <w:p>
@@ -821,7 +897,7 @@
         <w:drawing>
           <wp:inline xmlns:a="http://schemas.openxmlformats.org/drawingml/2006/main" xmlns:pic="http://schemas.openxmlformats.org/drawingml/2006/picture">
             <wp:extent cx="5806440" cy="2006442"/>
-            <wp:docPr id="3" name="Picture 3" descr="Hình 3. Mosquitto, InfluxDB và Grafana ở trạng thái healthy trên Docker" title="Hình 3. Mosquitto, InfluxDB và Grafana ở trạng thái healthy trên Docker"/>
+            <wp:docPr id="4" name="Picture 4" descr="Hình 4. Mosquitto, InfluxDB và Grafana ở trạng thái healthy trên Docker" title="Hình 4. Mosquitto, InfluxDB và Grafana ở trạng thái healthy trên Docker"/>
             <wp:cNvGraphicFramePr>
               <a:graphicFrameLocks noChangeAspect="1"/>
             </wp:cNvGraphicFramePr>
@@ -833,7 +909,7 @@
                     <pic:cNvPicPr/>
                   </pic:nvPicPr>
                   <pic:blipFill>
-                    <a:blip r:embed="rId16"/>
+                    <a:blip r:embed="rId18"/>
                     <a:stretch>
                       <a:fillRect/>
                     </a:stretch>
@@ -857,7 +933,7 @@
         <w:pStyle w:val="Caption"/>
       </w:pPr>
       <w:r>
-        <w:t>Hình 3. Mosquitto, InfluxDB và Grafana ở trạng thái healthy trên Docker</w:t>
+        <w:t>Hình 4. Mosquitto, InfluxDB và Grafana ở trạng thái healthy trên Docker</w:t>
       </w:r>
     </w:p>
     <w:p>
@@ -1476,7 +1552,7 @@
         <w:drawing>
           <wp:inline xmlns:a="http://schemas.openxmlformats.org/drawingml/2006/main" xmlns:pic="http://schemas.openxmlformats.org/drawingml/2006/picture">
             <wp:extent cx="6126480" cy="2786809"/>
-            <wp:docPr id="4" name="Picture 4" descr="Hình 4. Dữ liệu cảm biến thô trong InfluxDB Data Explorer" title="Hình 4. Dữ liệu cảm biến thô trong InfluxDB Data Explorer"/>
+            <wp:docPr id="5" name="Picture 5" descr="Hình 5. Dữ liệu cảm biến thô trong InfluxDB Data Explorer" title="Hình 5. Dữ liệu cảm biến thô trong InfluxDB Data Explorer"/>
             <wp:cNvGraphicFramePr>
               <a:graphicFrameLocks noChangeAspect="1"/>
             </wp:cNvGraphicFramePr>
@@ -1488,7 +1564,7 @@
                     <pic:cNvPicPr/>
                   </pic:nvPicPr>
                   <pic:blipFill>
-                    <a:blip r:embed="rId17"/>
+                    <a:blip r:embed="rId19"/>
                     <a:stretch>
                       <a:fillRect/>
                     </a:stretch>
@@ -1512,7 +1588,7 @@
         <w:pStyle w:val="Caption"/>
       </w:pPr>
       <w:r>
-        <w:t>Hình 4. Dữ liệu cảm biến thô trong InfluxDB Data Explorer</w:t>
+        <w:t>Hình 5. Dữ liệu cảm biến thô trong InfluxDB Data Explorer</w:t>
       </w:r>
     </w:p>
     <w:p>
@@ -1630,7 +1706,7 @@
         <w:drawing>
           <wp:inline xmlns:a="http://schemas.openxmlformats.org/drawingml/2006/main" xmlns:pic="http://schemas.openxmlformats.org/drawingml/2006/picture">
             <wp:extent cx="5806440" cy="2729846"/>
-            <wp:docPr id="5" name="Picture 5" descr="Hình 5. Dữ liệu sau resampling và trích xuất đặc trưng trong iot_processed" title="Hình 5. Dữ liệu sau resampling và trích xuất đặc trưng trong iot_processed"/>
+            <wp:docPr id="6" name="Picture 6" descr="Hình 6. Dữ liệu sau resampling và trích xuất đặc trưng trong iot_processed" title="Hình 6. Dữ liệu sau resampling và trích xuất đặc trưng trong iot_processed"/>
             <wp:cNvGraphicFramePr>
               <a:graphicFrameLocks noChangeAspect="1"/>
             </wp:cNvGraphicFramePr>
@@ -1642,7 +1718,7 @@
                     <pic:cNvPicPr/>
                   </pic:nvPicPr>
                   <pic:blipFill>
-                    <a:blip r:embed="rId18"/>
+                    <a:blip r:embed="rId20"/>
                     <a:stretch>
                       <a:fillRect/>
                     </a:stretch>
@@ -1666,7 +1742,7 @@
         <w:pStyle w:val="Caption"/>
       </w:pPr>
       <w:r>
-        <w:t>Hình 5. Dữ liệu sau resampling và trích xuất đặc trưng trong iot_processed</w:t>
+        <w:t>Hình 6. Dữ liệu sau resampling và trích xuất đặc trưng trong iot_processed</w:t>
       </w:r>
     </w:p>
     <w:tbl>
@@ -2199,7 +2275,7 @@
         <w:drawing>
           <wp:inline xmlns:a="http://schemas.openxmlformats.org/drawingml/2006/main" xmlns:pic="http://schemas.openxmlformats.org/drawingml/2006/picture">
             <wp:extent cx="5989320" cy="4743367"/>
-            <wp:docPr id="6" name="Picture 6" descr="Hình 6. Dashboard Grafana giám sát pipeline IoT" title="Hình 6. Dashboard Grafana giám sát pipeline IoT"/>
+            <wp:docPr id="7" name="Picture 7" descr="Hình 7. Dashboard Grafana giám sát pipeline IoT" title="Hình 7. Dashboard Grafana giám sát pipeline IoT"/>
             <wp:cNvGraphicFramePr>
               <a:graphicFrameLocks noChangeAspect="1"/>
             </wp:cNvGraphicFramePr>
@@ -2211,7 +2287,7 @@
                     <pic:cNvPicPr/>
                   </pic:nvPicPr>
                   <pic:blipFill>
-                    <a:blip r:embed="rId19"/>
+                    <a:blip r:embed="rId21"/>
                     <a:stretch>
                       <a:fillRect/>
                     </a:stretch>
@@ -2235,7 +2311,7 @@
         <w:pStyle w:val="Caption"/>
       </w:pPr>
       <w:r>
-        <w:t>Hình 6. Dashboard Grafana giám sát pipeline IoT</w:t>
+        <w:t>Hình 7. Dashboard Grafana giám sát pipeline IoT</w:t>
       </w:r>
     </w:p>
     <w:tbl>
@@ -2500,6 +2576,21 @@
     </w:tbl>
     <w:p>
       <w:pPr>
+        <w:pStyle w:val="Heading2"/>
+      </w:pPr>
+      <w:r>
+        <w:rPr>
+          <w:rFonts w:ascii="Times New Roman" w:hAnsi="Times New Roman" w:eastAsia="Times New Roman"/>
+          <w:b/>
+          <w:i w:val="0"/>
+          <w:color w:val="000000"/>
+          <w:sz w:val="24"/>
+        </w:rPr>
+        <w:t>Phân tích độ trễ, lưu trữ và đề xuất cải tiến</w:t>
+      </w:r>
+    </w:p>
+    <w:p>
+      <w:pPr>
         <w:spacing w:line="269" w:lineRule="auto" w:after="20"/>
         <w:ind w:firstLine="369"/>
         <w:jc w:val="both"/>
@@ -2510,9 +2601,9 @@
           <w:b w:val="0"/>
           <w:i w:val="0"/>
           <w:color w:val="000000"/>
-          <w:sz w:val="20"/>
+          <w:sz w:val="19"/>
         </w:rPr>
-        <w:t>Trong bộ dữ liệu demo, latency được sinh trong khoảng 8–85 ms nên p95 đạt 82 ms. Với Wokwi, latency có thể dao động lớn hơn do đồng hồ mô phỏng và NTP. Dung lượng 812 KB cho hơn một nghìn mẫu cho thấy chi phí lưu trữ của bài lab nhỏ; retention 30 ngày cho raw và 180 ngày cho processed là phù hợp.</w:t>
+        <w:t>Trong bộ dữ liệu demo, latency nằm trong khoảng 8–85 ms nên p95 đạt 82 ms. Một số đỉnh trễ của Wokwi xuất phát từ đồng hồ mô phỏng và thời điểm đồng bộ NTP. InfluxDB sử dụng 812 KB cho 1.129 mẫu; retention 30 ngày cho raw và 180 ngày cho processed giúp cân bằng khả năng truy vết với dung lượng lưu trữ. Khi triển khai thực tế, hệ thống nên bổ sung TLS và xác thực MQTT, cảnh báo Grafana theo ngưỡng, cơ chế retry/dead-letter cho bản tin lỗi và lịch preprocessing tự động.</w:t>
       </w:r>
     </w:p>
     <w:p>
@@ -2562,7 +2653,7 @@
         <w:drawing>
           <wp:inline xmlns:a="http://schemas.openxmlformats.org/drawingml/2006/main" xmlns:pic="http://schemas.openxmlformats.org/drawingml/2006/picture">
             <wp:extent cx="5532120" cy="2393221"/>
-            <wp:docPr id="7" name="Picture 7" descr="Hình 7. Gateway phát hiện mất gói, bản tin trùng và độ ẩm vượt phạm vi" title="Hình 7. Gateway phát hiện mất gói, bản tin trùng và độ ẩm vượt phạm vi"/>
+            <wp:docPr id="8" name="Picture 8" descr="Hình 8. Gateway phát hiện mất gói, bản tin trùng và độ ẩm vượt phạm vi" title="Hình 8. Gateway phát hiện mất gói, bản tin trùng và độ ẩm vượt phạm vi"/>
             <wp:cNvGraphicFramePr>
               <a:graphicFrameLocks noChangeAspect="1"/>
             </wp:cNvGraphicFramePr>
@@ -2574,7 +2665,7 @@
                     <pic:cNvPicPr/>
                   </pic:nvPicPr>
                   <pic:blipFill>
-                    <a:blip r:embed="rId20"/>
+                    <a:blip r:embed="rId22"/>
                     <a:stretch>
                       <a:fillRect/>
                     </a:stretch>
@@ -2598,7 +2689,7 @@
         <w:pStyle w:val="Caption"/>
       </w:pPr>
       <w:r>
-        <w:t>Hình 7. Gateway phát hiện mất gói, bản tin trùng và độ ẩm vượt phạm vi</w:t>
+        <w:t>Hình 8. Gateway phát hiện mất gói, bản tin trùng và độ ẩm vượt phạm vi</w:t>
       </w:r>
     </w:p>
     <w:p>
@@ -2611,7 +2702,7 @@
         <w:drawing>
           <wp:inline xmlns:a="http://schemas.openxmlformats.org/drawingml/2006/main" xmlns:pic="http://schemas.openxmlformats.org/drawingml/2006/picture">
             <wp:extent cx="5212080" cy="2197393"/>
-            <wp:docPr id="8" name="Picture 8" descr="Hình 8. Toàn bộ 36 trường hợp kiểm thử tự động đều thành công" title="Hình 8. Toàn bộ 36 trường hợp kiểm thử tự động đều thành công"/>
+            <wp:docPr id="9" name="Picture 9" descr="Hình 9. Toàn bộ 36 trường hợp kiểm thử tự động đều thành công" title="Hình 9. Toàn bộ 36 trường hợp kiểm thử tự động đều thành công"/>
             <wp:cNvGraphicFramePr>
               <a:graphicFrameLocks noChangeAspect="1"/>
             </wp:cNvGraphicFramePr>
@@ -2623,7 +2714,7 @@
                     <pic:cNvPicPr/>
                   </pic:nvPicPr>
                   <pic:blipFill>
-                    <a:blip r:embed="rId21"/>
+                    <a:blip r:embed="rId23"/>
                     <a:stretch>
                       <a:fillRect/>
                     </a:stretch>
@@ -2647,7 +2738,7 @@
         <w:pStyle w:val="Caption"/>
       </w:pPr>
       <w:r>
-        <w:t>Hình 8. Toàn bộ 36 trường hợp kiểm thử tự động đều thành công</w:t>
+        <w:t>Hình 9. Toàn bộ 36 trường hợp kiểm thử tự động đều thành công</w:t>
       </w:r>
     </w:p>
     <w:p>
@@ -3938,9 +4029,6 @@
     <w:qFormat/>
     <w:rsid w:val="00FC693F"/>
     <w:pPr>
-      <w:pBdr>
-        <w:bottom w:val="single" w:sz="8" w:space="4" w:color="4F81BD" w:themeColor="accent1"/>
-      </w:pBdr>
       <w:spacing w:after="60" w:line="240" w:lineRule="auto" w:before="0"/>
       <w:contextualSpacing/>
       <w:jc w:val="center"/>

</xml_diff>